<commit_message>
docs(semana7): documentar patrones estructurales adapter y bridge
</commit_message>
<xml_diff>
--- a/Semana7/ProyectoSemana7.docx
+++ b/Semana7/ProyectoSemana7.docx
@@ -46,7 +46,9 @@
         <w:br/>
         <w:t>Estudiante: Miguel Eduardo Ardila Cossio (meac@uts.edu.co)</w:t>
         <w:br/>
-        <w:t>Dominio: Sistema Inteligente de Gestión de Pedidos, Crédito y Facturación SmartOrders Enterprise</w:t>
+        <w:t>Fecha de Entrega: 03/10/2026</w:t>
+        <w:br/>
+        <w:t>Dominio: Sistema General Académico &amp; SmartOrders Enterprise</w:t>
         <w:br/>
       </w:r>
     </w:p>

</xml_diff>